<commit_message>
PAMsim: write each simulation into its own folder
New option "Own folder per simulation" (on by default, remembered):
files of a simulation go to <output folder>/<file name>/, created
automatically, for single runs and for batches from the planner.
Characters Windows does not allow in names are replaced by "_".
"Open folder" and the status line point to the last simulation folder.
Guide, Column guide sheet and README updated.

Co-Authored-By: Claude Opus 5.5 <noreply@anthropic.com>
Claude-Session: https://claude.ai/code/session_01Joozi2xHrDHzPbzwpUN1Xk
</commit_message>
<xml_diff>
--- a/planning/PAMsim_planner_guide.docx
+++ b/planning/PAMsim_planner_guide.docx
@@ -1315,7 +1315,7 @@
                 <w:sz w:val="19"/>
                 <w:szCs w:val="19"/>
               </w:rPr>
-              <w:t xml:space="preserve">Files are written as &lt;name&gt;_1.sim, &lt;name&gt;_2.sim, ...</w:t>
+              <w:t xml:space="preserve">Name of the simulation: its folder &lt;Output folder&gt;/&lt;name&gt;/ and its files &lt;name&gt;_1.sim, &lt;name&gt;_2.sim, ...</w:t>
             </w:r>
           </w:p>
         </w:tc>
@@ -1619,7 +1619,7 @@
                 <w:sz w:val="19"/>
                 <w:szCs w:val="19"/>
               </w:rPr>
-              <w:t xml:space="preserve">Folder for the files; must exist on the PC that runs PAMsim</w:t>
+              <w:t xml:space="preserve">Main folder; each simulation gets its own subfolder in it (created automatically). Must exist on the PC that runs PAMsim</w:t>
             </w:r>
           </w:p>
         </w:tc>
@@ -7689,7 +7689,59 @@
           <w:sz w:val="21"/>
           <w:szCs w:val="21"/>
         </w:rPr>
-        <w:t xml:space="preserve">Every simulation needs its own file name (or its own folder) - two rows with the same name and folder overwrite each other's files.</w:t>
+        <w:t xml:space="preserve">Each simulation is written into its own folder named after its file name, e.g. </w:t>
+      </w:r>
+      <w:r>
+        <w:rPr>
+          <w:rFonts w:ascii="Consolas" w:cs="Consolas" w:eastAsia="Consolas" w:hAnsi="Consolas"/>
+          <w:sz w:val="19"/>
+          <w:szCs w:val="19"/>
+        </w:rPr>
+        <w:t xml:space="preserve">C:\Sims\Crazy_2\Crazy_2_1.sim</w:t>
+      </w:r>
+      <w:r>
+        <w:rPr>
+          <w:rFonts w:ascii="Arial" w:cs="Arial" w:eastAsia="Arial" w:hAnsi="Arial"/>
+          <w:sz w:val="21"/>
+          <w:szCs w:val="21"/>
+        </w:rPr>
+        <w:t xml:space="preserve"> - the folder is created automatically. Switch this off in PAMsim's Output box (Own folder per simulation) to write all files into the output folder directly.</w:t>
+      </w:r>
+    </w:p>
+    <w:p>
+      <w:pPr>
+        <w:pStyle w:val="ListParagraph"/>
+        <w:numPr>
+          <w:ilvl w:val="0"/>
+          <w:numId w:val="2"/>
+        </w:numPr>
+        <w:spacing w:after="60"/>
+      </w:pPr>
+      <w:r>
+        <w:rPr>
+          <w:rFonts w:ascii="Arial" w:cs="Arial" w:eastAsia="Arial" w:hAnsi="Arial"/>
+          <w:sz w:val="21"/>
+          <w:szCs w:val="21"/>
+        </w:rPr>
+        <w:t xml:space="preserve">Every simulation needs its own file name - two rows with the same name and output folder write into the same folder and overwrite each other's files.</w:t>
+      </w:r>
+    </w:p>
+    <w:p>
+      <w:pPr>
+        <w:pStyle w:val="ListParagraph"/>
+        <w:numPr>
+          <w:ilvl w:val="0"/>
+          <w:numId w:val="2"/>
+        </w:numPr>
+        <w:spacing w:after="60"/>
+      </w:pPr>
+      <w:r>
+        <w:rPr>
+          <w:rFonts w:ascii="Arial" w:cs="Arial" w:eastAsia="Arial" w:hAnsi="Arial"/>
+          <w:sz w:val="21"/>
+          <w:szCs w:val="21"/>
+        </w:rPr>
+        <w:t xml:space="preserve">Characters that Windows does not allow in names (&lt; &gt; : " / \ | ? *) are replaced by _.</w:t>
       </w:r>
     </w:p>
     <w:p>

</xml_diff>